<commit_message>
Mejorar algoritmo de clasificacion de texturas para emplear caracteristicas hibridas de color HSV y varianza local de textura, y usar imagen sintetica texturizada de alta fidelidad. Se actualiza el informe tecnico Word y las imagenes de la web.
</commit_message>
<xml_diff>
--- a/Informe_Tecnico_JonathanGutierrez.docx
+++ b/Informe_Tecnico_JonathanGutierrez.docx
@@ -191,7 +191,7 @@
                 <w:rFonts w:ascii="Calibri" w:hAnsi="Calibri"/>
                 <w:sz w:val="22"/>
               </w:rPr>
-              <w:t>08 de junio de 2026</w:t>
+              <w:t>12 de junio de 2026</w:t>
             </w:r>
           </w:p>
         </w:tc>
@@ -374,7 +374,7 @@
       <w:r>
         <w:drawing>
           <wp:inline xmlns:a="http://schemas.openxmlformats.org/drawingml/2006/main" xmlns:pic="http://schemas.openxmlformats.org/drawingml/2006/picture">
-            <wp:extent cx="5486400" cy="2032000"/>
+            <wp:extent cx="5486400" cy="2709333"/>
             <wp:docPr id="1" name="Picture 1"/>
             <wp:cNvGraphicFramePr>
               <a:graphicFrameLocks noChangeAspect="1"/>
@@ -395,7 +395,7 @@
                   <pic:spPr>
                     <a:xfrm>
                       <a:off x="0" y="0"/>
-                      <a:ext cx="5486400" cy="2032000"/>
+                      <a:ext cx="5486400" cy="2709333"/>
                     </a:xfrm>
                     <a:prstGeom prst="rect"/>
                   </pic:spPr>

</xml_diff>

<commit_message>
Actualizar comparativa visual del filtro de suavizado a dos columnas (Antes/Despues) para una visualizacion optima y mas grande en la web y el reporte.
</commit_message>
<xml_diff>
--- a/Informe_Tecnico_JonathanGutierrez.docx
+++ b/Informe_Tecnico_JonathanGutierrez.docx
@@ -461,7 +461,7 @@
       <w:r>
         <w:drawing>
           <wp:inline xmlns:a="http://schemas.openxmlformats.org/drawingml/2006/main" xmlns:pic="http://schemas.openxmlformats.org/drawingml/2006/picture">
-            <wp:extent cx="5486400" cy="1353553"/>
+            <wp:extent cx="5486400" cy="2716040"/>
             <wp:docPr id="2" name="Picture 2"/>
             <wp:cNvGraphicFramePr>
               <a:graphicFrameLocks noChangeAspect="1"/>
@@ -482,7 +482,7 @@
                   <pic:spPr>
                     <a:xfrm>
                       <a:off x="0" y="0"/>
-                      <a:ext cx="5486400" cy="1353553"/>
+                      <a:ext cx="5486400" cy="2716040"/>
                     </a:xfrm>
                     <a:prstGeom prst="rect"/>
                   </pic:spPr>

</xml_diff>

<commit_message>
Optimize visual theme, 3D viewers quality, and increase image resolution to 800x800
</commit_message>
<xml_diff>
--- a/Informe_Tecnico_JonathanGutierrez.docx
+++ b/Informe_Tecnico_JonathanGutierrez.docx
@@ -374,7 +374,7 @@
       <w:r>
         <w:drawing>
           <wp:inline xmlns:a="http://schemas.openxmlformats.org/drawingml/2006/main" xmlns:pic="http://schemas.openxmlformats.org/drawingml/2006/picture">
-            <wp:extent cx="5486400" cy="2709333"/>
+            <wp:extent cx="5486400" cy="2717721"/>
             <wp:docPr id="1" name="Picture 1"/>
             <wp:cNvGraphicFramePr>
               <a:graphicFrameLocks noChangeAspect="1"/>
@@ -395,7 +395,7 @@
                   <pic:spPr>
                     <a:xfrm>
                       <a:off x="0" y="0"/>
-                      <a:ext cx="5486400" cy="2709333"/>
+                      <a:ext cx="5486400" cy="2717721"/>
                     </a:xfrm>
                     <a:prstGeom prst="rect"/>
                   </pic:spPr>
@@ -461,7 +461,7 @@
       <w:r>
         <w:drawing>
           <wp:inline xmlns:a="http://schemas.openxmlformats.org/drawingml/2006/main" xmlns:pic="http://schemas.openxmlformats.org/drawingml/2006/picture">
-            <wp:extent cx="5486400" cy="2716040"/>
+            <wp:extent cx="5486400" cy="2717721"/>
             <wp:docPr id="2" name="Picture 2"/>
             <wp:cNvGraphicFramePr>
               <a:graphicFrameLocks noChangeAspect="1"/>
@@ -482,7 +482,7 @@
                   <pic:spPr>
                     <a:xfrm>
                       <a:off x="0" y="0"/>
-                      <a:ext cx="5486400" cy="2716040"/>
+                      <a:ext cx="5486400" cy="2717721"/>
                     </a:xfrm>
                     <a:prstGeom prst="rect"/>
                   </pic:spPr>

</xml_diff>